<commit_message>
Update source reference table to match document ScrollTableNormal style
Orange header, alternating gray rows, Arial 9pt — consistent with the
existing table formatting in the Village of Estero Adaptation Plan.

https://claude.ai/code/session_01N7GS5E8hFMv2Ghq1rFV7MN
</commit_message>
<xml_diff>
--- a/estero_source_references.docx
+++ b/estero_source_references.docx
@@ -2,92 +2,74 @@
 <file path=word/document.xml><?xml version="1.0" encoding="utf-8"?>
 <w:document xmlns:wpc="http://schemas.microsoft.com/office/word/2010/wordprocessingCanvas" xmlns:mo="http://schemas.microsoft.com/office/mac/office/2008/main" xmlns:mc="http://schemas.openxmlformats.org/markup-compatibility/2006" xmlns:mv="urn:schemas-microsoft-com:mac:vml" xmlns:o="urn:schemas-microsoft-com:office:office" xmlns:r="http://schemas.openxmlformats.org/officeDocument/2006/relationships" xmlns:m="http://schemas.openxmlformats.org/officeDocument/2006/math" xmlns:v="urn:schemas-microsoft-com:vml" xmlns:wp14="http://schemas.microsoft.com/office/word/2010/wordprocessingDrawing" xmlns:wp="http://schemas.openxmlformats.org/drawingml/2006/wordprocessingDrawing" xmlns:w10="urn:schemas-microsoft-com:office:word" xmlns:w="http://schemas.openxmlformats.org/wordprocessingml/2006/main" xmlns:w14="http://schemas.microsoft.com/office/word/2010/wordml" xmlns:wpg="http://schemas.microsoft.com/office/word/2010/wordprocessingGroup" xmlns:wpi="http://schemas.microsoft.com/office/word/2010/wordprocessingInk" xmlns:wne="http://schemas.microsoft.com/office/word/2006/wordml" xmlns:wps="http://schemas.microsoft.com/office/word/2010/wordprocessingShape" mc:Ignorable="w14 wp14">
   <w:body>
+    <w:p>
+      <w:pPr>
+        <w:spacing w:after="200"/>
+      </w:pPr>
+      <w:r>
+        <w:rPr>
+          <w:rFonts w:ascii="Arial" w:hAnsi="Arial"/>
+          <w:b w:val="0"/>
+          <w:i w:val="0"/>
+          <w:sz w:val="22"/>
+        </w:rPr>
+        <w:t xml:space="preserve">The adaptation projects identified in this plan are informed by the </w:t>
+      </w:r>
+      <w:r>
+        <w:rPr>
+          <w:rFonts w:ascii="Arial" w:hAnsi="Arial"/>
+          <w:b/>
+          <w:i w:val="0"/>
+          <w:sz w:val="22"/>
+        </w:rPr>
+        <w:t>2026 Vulnerability Assessment and Stormwater Model Update Technical Report</w:t>
+      </w:r>
+      <w:r>
+        <w:rPr>
+          <w:rFonts w:ascii="Arial" w:hAnsi="Arial"/>
+          <w:b w:val="0"/>
+          <w:i w:val="0"/>
+          <w:sz w:val="22"/>
+        </w:rPr>
+        <w:t>, and are aligned with projects, recommendations, and priorities identified in eleven existing plans and studies for Village of Estero. For ease of reference, each source has been assigned a number below and is cited by that number in the project sheets.</w:t>
+      </w:r>
+    </w:p>
+    <w:p/>
     <w:tbl>
       <w:tblPr>
-        <w:tblStyle w:val="TableGrid"/>
         <w:tblW w:type="auto" w:w="0"/>
-        <w:jc w:val="center"/>
+        <w:jc w:val="left"/>
         <w:tblLook w:firstColumn="1" w:firstRow="1" w:lastColumn="0" w:lastRow="0" w:noHBand="0" w:noVBand="1" w:val="04A0"/>
       </w:tblPr>
       <w:tblGrid>
-        <w:gridCol w:w="9360"/>
+        <w:gridCol w:w="4680"/>
+        <w:gridCol w:w="4680"/>
       </w:tblGrid>
       <w:tr>
         <w:tc>
           <w:tcPr>
-            <w:tcW w:type="dxa" w:w="9360"/>
-            <w:shd w:val="clear" w:color="auto" w:fill="E8F0F7"/>
+            <w:tcW w:type="dxa" w:w="864"/>
+            <w:shd w:val="clear" w:color="auto" w:fill="FF8200" w:themeFill="accent2"/>
             <w:tcBorders>
-              <w:top w:val="single" w:sz="4" w:space="0" w:color="BDD0E0"/>
-              <w:bottom w:val="single" w:sz="4" w:space="0" w:color="BDD0E0"/>
-              <w:right w:val="single" w:sz="4" w:space="0" w:color="BDD0E0"/>
-              <w:left w:val="single" w:sz="18" w:space="0" w:color="2A6496"/>
+              <w:top w:val="single" w:sz="4" w:space="0" w:color="404040" w:themeColor="text2"/>
+              <w:left w:val="single" w:sz="4" w:space="0" w:color="404040" w:themeColor="text2"/>
+              <w:bottom w:val="single" w:sz="4" w:space="0" w:color="404040" w:themeColor="text2"/>
+              <w:right w:val="single" w:sz="4" w:space="0" w:color="404040" w:themeColor="text2"/>
             </w:tcBorders>
-          </w:tcPr>
-          <w:p>
-            <w:pPr>
-              <w:spacing w:before="120" w:after="120"/>
-              <w:ind w:left="144"/>
-            </w:pPr>
-            <w:r>
-              <w:rPr>
-                <w:rFonts w:ascii="Calibri" w:hAnsi="Calibri"/>
-                <w:b w:val="0"/>
-                <w:sz w:val="22"/>
-              </w:rPr>
-              <w:t xml:space="preserve">The adaptation projects identified in this plan are informed by the </w:t>
-            </w:r>
-            <w:r>
-              <w:rPr>
-                <w:rFonts w:ascii="Calibri" w:hAnsi="Calibri"/>
-                <w:b/>
-                <w:sz w:val="22"/>
-              </w:rPr>
-              <w:t>2026 Vulnerability Assessment and Stormwater Model Update Technical Report</w:t>
-            </w:r>
-            <w:r>
-              <w:rPr>
-                <w:rFonts w:ascii="Calibri" w:hAnsi="Calibri"/>
-                <w:b w:val="0"/>
-                <w:sz w:val="22"/>
-              </w:rPr>
-              <w:t>, and are aligned with projects, recommendations, and priorities identified in eleven existing plans and studies for Village of Estero. For ease of reference, each source has been assigned a number below and is cited by that number in the project sheets.</w:t>
-            </w:r>
-          </w:p>
-        </w:tc>
-      </w:tr>
-    </w:tbl>
-    <w:p/>
-    <w:tbl>
-      <w:tblPr>
-        <w:tblStyle w:val="TableGrid"/>
-        <w:tblW w:type="auto" w:w="0"/>
-        <w:jc w:val="center"/>
-        <w:tblLook w:firstColumn="1" w:firstRow="1" w:lastColumn="0" w:lastRow="0" w:noHBand="0" w:noVBand="1" w:val="04A0"/>
-      </w:tblPr>
-      <w:tblGrid>
-        <w:gridCol w:w="3120"/>
-        <w:gridCol w:w="3120"/>
-        <w:gridCol w:w="3120"/>
-      </w:tblGrid>
-      <w:tr>
-        <w:tc>
-          <w:tcPr>
-            <w:tcW w:type="dxa" w:w="792"/>
-            <w:shd w:val="clear" w:color="auto" w:fill="1A4F7A"/>
             <w:vAlign w:val="center"/>
           </w:tcPr>
           <w:p>
             <w:pPr>
-              <w:spacing w:before="100" w:after="100"/>
+              <w:spacing w:before="80" w:after="80"/>
               <w:jc w:val="center"/>
             </w:pPr>
             <w:r>
               <w:rPr>
-                <w:rFonts w:ascii="Calibri" w:hAnsi="Calibri"/>
+                <w:rFonts w:ascii="Arial" w:hAnsi="Arial"/>
                 <w:b/>
+                <w:i w:val="0"/>
                 <w:color w:val="FFFFFF"/>
-                <w:sz w:val="21"/>
+                <w:sz w:val="18"/>
               </w:rPr>
               <w:t>#</w:t>
             </w:r>
@@ -95,43 +77,28 @@
         </w:tc>
         <w:tc>
           <w:tcPr>
-            <w:tcW w:type="dxa" w:w="1512"/>
-            <w:shd w:val="clear" w:color="auto" w:fill="1A4F7A"/>
+            <w:tcW w:type="dxa" w:w="8496"/>
+            <w:shd w:val="clear" w:color="auto" w:fill="FF8200" w:themeFill="accent2"/>
+            <w:tcBorders>
+              <w:top w:val="single" w:sz="4" w:space="0" w:color="404040" w:themeColor="text2"/>
+              <w:left w:val="single" w:sz="4" w:space="0" w:color="404040" w:themeColor="text2"/>
+              <w:bottom w:val="single" w:sz="4" w:space="0" w:color="404040" w:themeColor="text2"/>
+              <w:right w:val="single" w:sz="4" w:space="0" w:color="404040" w:themeColor="text2"/>
+            </w:tcBorders>
             <w:vAlign w:val="center"/>
           </w:tcPr>
           <w:p>
             <w:pPr>
-              <w:spacing w:before="100" w:after="100"/>
-              <w:jc w:val="center"/>
-            </w:pPr>
-            <w:r>
-              <w:rPr>
-                <w:rFonts w:ascii="Calibri" w:hAnsi="Calibri"/>
-                <w:b/>
-                <w:color w:val="FFFFFF"/>
-                <w:sz w:val="21"/>
-              </w:rPr>
-              <w:t>YEAR</w:t>
-            </w:r>
-          </w:p>
-        </w:tc>
-        <w:tc>
-          <w:tcPr>
-            <w:tcW w:type="dxa" w:w="7776"/>
-            <w:shd w:val="clear" w:color="auto" w:fill="1A4F7A"/>
-            <w:vAlign w:val="center"/>
-          </w:tcPr>
-          <w:p>
-            <w:pPr>
-              <w:spacing w:before="100" w:after="100"/>
+              <w:spacing w:before="80" w:after="80"/>
               <w:jc w:val="left"/>
             </w:pPr>
             <w:r>
               <w:rPr>
-                <w:rFonts w:ascii="Calibri" w:hAnsi="Calibri"/>
+                <w:rFonts w:ascii="Arial" w:hAnsi="Arial"/>
                 <w:b/>
+                <w:i w:val="0"/>
                 <w:color w:val="FFFFFF"/>
-                <w:sz w:val="21"/>
+                <w:sz w:val="18"/>
               </w:rPr>
               <w:t>SOURCE DOCUMENT</w:t>
             </w:r>
@@ -141,21 +108,28 @@
       <w:tr>
         <w:tc>
           <w:tcPr>
-            <w:tcW w:type="dxa" w:w="792"/>
-            <w:shd w:val="clear" w:color="auto" w:fill="2A6496"/>
+            <w:tcW w:type="dxa" w:w="864"/>
+            <w:shd w:val="clear" w:color="auto" w:fill="FFFFFF"/>
+            <w:tcBorders>
+              <w:top w:val="single" w:sz="4" w:space="0" w:color="404040" w:themeColor="text2"/>
+              <w:left w:val="single" w:sz="4" w:space="0" w:color="404040" w:themeColor="text2"/>
+              <w:bottom w:val="single" w:sz="4" w:space="0" w:color="404040" w:themeColor="text2"/>
+              <w:right w:val="single" w:sz="4" w:space="0" w:color="404040" w:themeColor="text2"/>
+            </w:tcBorders>
             <w:vAlign w:val="center"/>
           </w:tcPr>
           <w:p>
             <w:pPr>
-              <w:spacing w:before="80" w:after="80"/>
+              <w:spacing w:before="60" w:after="60"/>
               <w:jc w:val="center"/>
             </w:pPr>
             <w:r>
               <w:rPr>
-                <w:rFonts w:ascii="Calibri" w:hAnsi="Calibri"/>
+                <w:rFonts w:ascii="Arial" w:hAnsi="Arial"/>
                 <w:b/>
-                <w:color w:val="FFFFFF"/>
-                <w:sz w:val="26"/>
+                <w:i w:val="0"/>
+                <w:color w:val="404040"/>
+                <w:sz w:val="18"/>
               </w:rPr>
               <w:t>1</w:t>
             </w:r>
@@ -163,46 +137,41 @@
         </w:tc>
         <w:tc>
           <w:tcPr>
-            <w:tcW w:type="dxa" w:w="1512"/>
-            <w:shd w:val="clear" w:color="auto" w:fill="2A6496"/>
+            <w:tcW w:type="dxa" w:w="8496"/>
+            <w:shd w:val="clear" w:color="auto" w:fill="FFFFFF"/>
+            <w:tcBorders>
+              <w:top w:val="single" w:sz="4" w:space="0" w:color="404040" w:themeColor="text2"/>
+              <w:left w:val="single" w:sz="4" w:space="0" w:color="404040" w:themeColor="text2"/>
+              <w:bottom w:val="single" w:sz="4" w:space="0" w:color="404040" w:themeColor="text2"/>
+              <w:right w:val="single" w:sz="4" w:space="0" w:color="404040" w:themeColor="text2"/>
+            </w:tcBorders>
             <w:vAlign w:val="center"/>
           </w:tcPr>
           <w:p>
             <w:pPr>
-              <w:spacing w:before="80" w:after="80"/>
-              <w:jc w:val="center"/>
-            </w:pPr>
-            <w:r>
-              <w:rPr>
-                <w:rFonts w:ascii="Calibri" w:hAnsi="Calibri"/>
-                <w:b/>
-                <w:color w:val="FFFFFF"/>
-                <w:sz w:val="20"/>
-              </w:rPr>
-              <w:t>2018</w:t>
-            </w:r>
-          </w:p>
-        </w:tc>
-        <w:tc>
-          <w:tcPr>
-            <w:tcW w:type="dxa" w:w="7776"/>
-            <w:shd w:val="clear" w:color="auto" w:fill="EAF3FB"/>
-            <w:vAlign w:val="center"/>
-          </w:tcPr>
-          <w:p>
-            <w:pPr>
-              <w:spacing w:before="80" w:after="80"/>
+              <w:spacing w:before="60" w:after="60"/>
               <w:ind w:left="72"/>
               <w:jc w:val="left"/>
             </w:pPr>
             <w:r>
               <w:rPr>
-                <w:rFonts w:ascii="Calibri" w:hAnsi="Calibri"/>
+                <w:rFonts w:ascii="Arial" w:hAnsi="Arial"/>
+                <w:b/>
+                <w:i w:val="0"/>
+                <w:color w:val="FF8200"/>
+                <w:sz w:val="18"/>
+              </w:rPr>
+              <w:t>2018</w:t>
+            </w:r>
+            <w:r>
+              <w:rPr>
+                <w:rFonts w:ascii="Arial" w:hAnsi="Arial"/>
                 <w:b w:val="0"/>
-                <w:color w:val="1A2A3A"/>
-                <w:sz w:val="22"/>
+                <w:i w:val="0"/>
+                <w:color w:val="404040"/>
+                <w:sz w:val="18"/>
               </w:rPr>
-              <w:t>Village of Estero Comprehensive Plan</w:t>
+              <w:t xml:space="preserve"> Village of Estero Comprehensive Plan</w:t>
             </w:r>
           </w:p>
         </w:tc>
@@ -210,21 +179,28 @@
       <w:tr>
         <w:tc>
           <w:tcPr>
-            <w:tcW w:type="dxa" w:w="792"/>
-            <w:shd w:val="clear" w:color="auto" w:fill="2A6496"/>
+            <w:tcW w:type="dxa" w:w="864"/>
+            <w:shd w:val="clear" w:color="auto" w:fill="D0CFCD"/>
+            <w:tcBorders>
+              <w:top w:val="single" w:sz="4" w:space="0" w:color="404040" w:themeColor="text2"/>
+              <w:left w:val="single" w:sz="4" w:space="0" w:color="404040" w:themeColor="text2"/>
+              <w:bottom w:val="single" w:sz="4" w:space="0" w:color="404040" w:themeColor="text2"/>
+              <w:right w:val="single" w:sz="4" w:space="0" w:color="404040" w:themeColor="text2"/>
+            </w:tcBorders>
             <w:vAlign w:val="center"/>
           </w:tcPr>
           <w:p>
             <w:pPr>
-              <w:spacing w:before="80" w:after="80"/>
+              <w:spacing w:before="60" w:after="60"/>
               <w:jc w:val="center"/>
             </w:pPr>
             <w:r>
               <w:rPr>
-                <w:rFonts w:ascii="Calibri" w:hAnsi="Calibri"/>
+                <w:rFonts w:ascii="Arial" w:hAnsi="Arial"/>
                 <w:b/>
-                <w:color w:val="FFFFFF"/>
-                <w:sz w:val="26"/>
+                <w:i w:val="0"/>
+                <w:color w:val="404040"/>
+                <w:sz w:val="18"/>
               </w:rPr>
               <w:t>2</w:t>
             </w:r>
@@ -232,46 +208,41 @@
         </w:tc>
         <w:tc>
           <w:tcPr>
-            <w:tcW w:type="dxa" w:w="1512"/>
-            <w:shd w:val="clear" w:color="auto" w:fill="2A6496"/>
+            <w:tcW w:type="dxa" w:w="8496"/>
+            <w:shd w:val="clear" w:color="auto" w:fill="D0CFCD"/>
+            <w:tcBorders>
+              <w:top w:val="single" w:sz="4" w:space="0" w:color="404040" w:themeColor="text2"/>
+              <w:left w:val="single" w:sz="4" w:space="0" w:color="404040" w:themeColor="text2"/>
+              <w:bottom w:val="single" w:sz="4" w:space="0" w:color="404040" w:themeColor="text2"/>
+              <w:right w:val="single" w:sz="4" w:space="0" w:color="404040" w:themeColor="text2"/>
+            </w:tcBorders>
             <w:vAlign w:val="center"/>
           </w:tcPr>
           <w:p>
             <w:pPr>
-              <w:spacing w:before="80" w:after="80"/>
-              <w:jc w:val="center"/>
-            </w:pPr>
-            <w:r>
-              <w:rPr>
-                <w:rFonts w:ascii="Calibri" w:hAnsi="Calibri"/>
-                <w:b/>
-                <w:color w:val="FFFFFF"/>
-                <w:sz w:val="20"/>
-              </w:rPr>
-              <w:t>2018</w:t>
-            </w:r>
-          </w:p>
-        </w:tc>
-        <w:tc>
-          <w:tcPr>
-            <w:tcW w:type="dxa" w:w="7776"/>
-            <w:shd w:val="clear" w:color="auto" w:fill="DDEEF8"/>
-            <w:vAlign w:val="center"/>
-          </w:tcPr>
-          <w:p>
-            <w:pPr>
-              <w:spacing w:before="80" w:after="80"/>
+              <w:spacing w:before="60" w:after="60"/>
               <w:ind w:left="72"/>
               <w:jc w:val="left"/>
             </w:pPr>
             <w:r>
               <w:rPr>
-                <w:rFonts w:ascii="Calibri" w:hAnsi="Calibri"/>
+                <w:rFonts w:ascii="Arial" w:hAnsi="Arial"/>
+                <w:b/>
+                <w:i w:val="0"/>
+                <w:color w:val="FF8200"/>
+                <w:sz w:val="18"/>
+              </w:rPr>
+              <w:t>2018</w:t>
+            </w:r>
+            <w:r>
+              <w:rPr>
+                <w:rFonts w:ascii="Arial" w:hAnsi="Arial"/>
                 <w:b w:val="0"/>
-                <w:color w:val="1A2A3A"/>
-                <w:sz w:val="22"/>
+                <w:i w:val="0"/>
+                <w:color w:val="404040"/>
+                <w:sz w:val="18"/>
               </w:rPr>
-              <w:t>Village of Estero Stormwater Master Plan</w:t>
+              <w:t xml:space="preserve"> Village of Estero Stormwater Master Plan</w:t>
             </w:r>
           </w:p>
         </w:tc>
@@ -279,21 +250,28 @@
       <w:tr>
         <w:tc>
           <w:tcPr>
-            <w:tcW w:type="dxa" w:w="792"/>
-            <w:shd w:val="clear" w:color="auto" w:fill="27AE60"/>
+            <w:tcW w:type="dxa" w:w="864"/>
+            <w:shd w:val="clear" w:color="auto" w:fill="FFFFFF"/>
+            <w:tcBorders>
+              <w:top w:val="single" w:sz="4" w:space="0" w:color="404040" w:themeColor="text2"/>
+              <w:left w:val="single" w:sz="4" w:space="0" w:color="404040" w:themeColor="text2"/>
+              <w:bottom w:val="single" w:sz="4" w:space="0" w:color="404040" w:themeColor="text2"/>
+              <w:right w:val="single" w:sz="4" w:space="0" w:color="404040" w:themeColor="text2"/>
+            </w:tcBorders>
             <w:vAlign w:val="center"/>
           </w:tcPr>
           <w:p>
             <w:pPr>
-              <w:spacing w:before="80" w:after="80"/>
+              <w:spacing w:before="60" w:after="60"/>
               <w:jc w:val="center"/>
             </w:pPr>
             <w:r>
               <w:rPr>
-                <w:rFonts w:ascii="Calibri" w:hAnsi="Calibri"/>
+                <w:rFonts w:ascii="Arial" w:hAnsi="Arial"/>
                 <w:b/>
-                <w:color w:val="FFFFFF"/>
-                <w:sz w:val="26"/>
+                <w:i w:val="0"/>
+                <w:color w:val="404040"/>
+                <w:sz w:val="18"/>
               </w:rPr>
               <w:t>3</w:t>
             </w:r>
@@ -301,46 +279,41 @@
         </w:tc>
         <w:tc>
           <w:tcPr>
-            <w:tcW w:type="dxa" w:w="1512"/>
-            <w:shd w:val="clear" w:color="auto" w:fill="27AE60"/>
+            <w:tcW w:type="dxa" w:w="8496"/>
+            <w:shd w:val="clear" w:color="auto" w:fill="FFFFFF"/>
+            <w:tcBorders>
+              <w:top w:val="single" w:sz="4" w:space="0" w:color="404040" w:themeColor="text2"/>
+              <w:left w:val="single" w:sz="4" w:space="0" w:color="404040" w:themeColor="text2"/>
+              <w:bottom w:val="single" w:sz="4" w:space="0" w:color="404040" w:themeColor="text2"/>
+              <w:right w:val="single" w:sz="4" w:space="0" w:color="404040" w:themeColor="text2"/>
+            </w:tcBorders>
             <w:vAlign w:val="center"/>
           </w:tcPr>
           <w:p>
             <w:pPr>
-              <w:spacing w:before="80" w:after="80"/>
-              <w:jc w:val="center"/>
-            </w:pPr>
-            <w:r>
-              <w:rPr>
-                <w:rFonts w:ascii="Calibri" w:hAnsi="Calibri"/>
-                <w:b/>
-                <w:color w:val="FFFFFF"/>
-                <w:sz w:val="20"/>
-              </w:rPr>
-              <w:t>2023</w:t>
-            </w:r>
-          </w:p>
-        </w:tc>
-        <w:tc>
-          <w:tcPr>
-            <w:tcW w:type="dxa" w:w="7776"/>
-            <w:shd w:val="clear" w:color="auto" w:fill="E6F4EA"/>
-            <w:vAlign w:val="center"/>
-          </w:tcPr>
-          <w:p>
-            <w:pPr>
-              <w:spacing w:before="80" w:after="80"/>
+              <w:spacing w:before="60" w:after="60"/>
               <w:ind w:left="72"/>
               <w:jc w:val="left"/>
             </w:pPr>
             <w:r>
               <w:rPr>
-                <w:rFonts w:ascii="Calibri" w:hAnsi="Calibri"/>
+                <w:rFonts w:ascii="Arial" w:hAnsi="Arial"/>
+                <w:b/>
+                <w:i w:val="0"/>
+                <w:color w:val="FF8200"/>
+                <w:sz w:val="18"/>
+              </w:rPr>
+              <w:t>2023</w:t>
+            </w:r>
+            <w:r>
+              <w:rPr>
+                <w:rFonts w:ascii="Arial" w:hAnsi="Arial"/>
                 <w:b w:val="0"/>
-                <w:color w:val="1A2A3A"/>
-                <w:sz w:val="22"/>
+                <w:i w:val="0"/>
+                <w:color w:val="404040"/>
+                <w:sz w:val="18"/>
               </w:rPr>
-              <w:t>Village of Estero Flood Mitigation Project Memorandum</w:t>
+              <w:t xml:space="preserve"> Village of Estero Flood Mitigation Project Memorandum</w:t>
             </w:r>
           </w:p>
         </w:tc>
@@ -348,21 +321,28 @@
       <w:tr>
         <w:tc>
           <w:tcPr>
-            <w:tcW w:type="dxa" w:w="792"/>
-            <w:shd w:val="clear" w:color="auto" w:fill="D4840D"/>
+            <w:tcW w:type="dxa" w:w="864"/>
+            <w:shd w:val="clear" w:color="auto" w:fill="D0CFCD"/>
+            <w:tcBorders>
+              <w:top w:val="single" w:sz="4" w:space="0" w:color="404040" w:themeColor="text2"/>
+              <w:left w:val="single" w:sz="4" w:space="0" w:color="404040" w:themeColor="text2"/>
+              <w:bottom w:val="single" w:sz="4" w:space="0" w:color="404040" w:themeColor="text2"/>
+              <w:right w:val="single" w:sz="4" w:space="0" w:color="404040" w:themeColor="text2"/>
+            </w:tcBorders>
             <w:vAlign w:val="center"/>
           </w:tcPr>
           <w:p>
             <w:pPr>
-              <w:spacing w:before="80" w:after="80"/>
+              <w:spacing w:before="60" w:after="60"/>
               <w:jc w:val="center"/>
             </w:pPr>
             <w:r>
               <w:rPr>
-                <w:rFonts w:ascii="Calibri" w:hAnsi="Calibri"/>
+                <w:rFonts w:ascii="Arial" w:hAnsi="Arial"/>
                 <w:b/>
-                <w:color w:val="FFFFFF"/>
-                <w:sz w:val="26"/>
+                <w:i w:val="0"/>
+                <w:color w:val="404040"/>
+                <w:sz w:val="18"/>
               </w:rPr>
               <w:t>4</w:t>
             </w:r>
@@ -370,46 +350,41 @@
         </w:tc>
         <w:tc>
           <w:tcPr>
-            <w:tcW w:type="dxa" w:w="1512"/>
-            <w:shd w:val="clear" w:color="auto" w:fill="D4840D"/>
+            <w:tcW w:type="dxa" w:w="8496"/>
+            <w:shd w:val="clear" w:color="auto" w:fill="D0CFCD"/>
+            <w:tcBorders>
+              <w:top w:val="single" w:sz="4" w:space="0" w:color="404040" w:themeColor="text2"/>
+              <w:left w:val="single" w:sz="4" w:space="0" w:color="404040" w:themeColor="text2"/>
+              <w:bottom w:val="single" w:sz="4" w:space="0" w:color="404040" w:themeColor="text2"/>
+              <w:right w:val="single" w:sz="4" w:space="0" w:color="404040" w:themeColor="text2"/>
+            </w:tcBorders>
             <w:vAlign w:val="center"/>
           </w:tcPr>
           <w:p>
             <w:pPr>
-              <w:spacing w:before="80" w:after="80"/>
-              <w:jc w:val="center"/>
-            </w:pPr>
-            <w:r>
-              <w:rPr>
-                <w:rFonts w:ascii="Calibri" w:hAnsi="Calibri"/>
-                <w:b/>
-                <w:color w:val="FFFFFF"/>
-                <w:sz w:val="20"/>
-              </w:rPr>
-              <w:t>2025</w:t>
-            </w:r>
-          </w:p>
-        </w:tc>
-        <w:tc>
-          <w:tcPr>
-            <w:tcW w:type="dxa" w:w="7776"/>
-            <w:shd w:val="clear" w:color="auto" w:fill="FEF9E7"/>
-            <w:vAlign w:val="center"/>
-          </w:tcPr>
-          <w:p>
-            <w:pPr>
-              <w:spacing w:before="80" w:after="80"/>
+              <w:spacing w:before="60" w:after="60"/>
               <w:ind w:left="72"/>
               <w:jc w:val="left"/>
             </w:pPr>
             <w:r>
               <w:rPr>
-                <w:rFonts w:ascii="Calibri" w:hAnsi="Calibri"/>
+                <w:rFonts w:ascii="Arial" w:hAnsi="Arial"/>
+                <w:b/>
+                <w:i w:val="0"/>
+                <w:color w:val="FF8200"/>
+                <w:sz w:val="18"/>
+              </w:rPr>
+              <w:t>2025</w:t>
+            </w:r>
+            <w:r>
+              <w:rPr>
+                <w:rFonts w:ascii="Arial" w:hAnsi="Arial"/>
                 <w:b w:val="0"/>
-                <w:color w:val="1A2A3A"/>
-                <w:sz w:val="22"/>
+                <w:i w:val="0"/>
+                <w:color w:val="404040"/>
+                <w:sz w:val="18"/>
               </w:rPr>
-              <w:t>Village of Estero Hazard Mitigation Grant Program Memorandum: Pond Design</w:t>
+              <w:t xml:space="preserve"> Village of Estero Hazard Mitigation Grant Program Memorandum: Pond Design</w:t>
             </w:r>
           </w:p>
         </w:tc>
@@ -417,21 +392,28 @@
       <w:tr>
         <w:tc>
           <w:tcPr>
-            <w:tcW w:type="dxa" w:w="792"/>
-            <w:shd w:val="clear" w:color="auto" w:fill="8E44AD"/>
+            <w:tcW w:type="dxa" w:w="864"/>
+            <w:shd w:val="clear" w:color="auto" w:fill="FFFFFF"/>
+            <w:tcBorders>
+              <w:top w:val="single" w:sz="4" w:space="0" w:color="404040" w:themeColor="text2"/>
+              <w:left w:val="single" w:sz="4" w:space="0" w:color="404040" w:themeColor="text2"/>
+              <w:bottom w:val="single" w:sz="4" w:space="0" w:color="404040" w:themeColor="text2"/>
+              <w:right w:val="single" w:sz="4" w:space="0" w:color="404040" w:themeColor="text2"/>
+            </w:tcBorders>
             <w:vAlign w:val="center"/>
           </w:tcPr>
           <w:p>
             <w:pPr>
-              <w:spacing w:before="80" w:after="80"/>
+              <w:spacing w:before="60" w:after="60"/>
               <w:jc w:val="center"/>
             </w:pPr>
             <w:r>
               <w:rPr>
-                <w:rFonts w:ascii="Calibri" w:hAnsi="Calibri"/>
+                <w:rFonts w:ascii="Arial" w:hAnsi="Arial"/>
                 <w:b/>
-                <w:color w:val="FFFFFF"/>
-                <w:sz w:val="26"/>
+                <w:i w:val="0"/>
+                <w:color w:val="404040"/>
+                <w:sz w:val="18"/>
               </w:rPr>
               <w:t>5</w:t>
             </w:r>
@@ -439,46 +421,41 @@
         </w:tc>
         <w:tc>
           <w:tcPr>
-            <w:tcW w:type="dxa" w:w="1512"/>
-            <w:shd w:val="clear" w:color="auto" w:fill="8E44AD"/>
+            <w:tcW w:type="dxa" w:w="8496"/>
+            <w:shd w:val="clear" w:color="auto" w:fill="FFFFFF"/>
+            <w:tcBorders>
+              <w:top w:val="single" w:sz="4" w:space="0" w:color="404040" w:themeColor="text2"/>
+              <w:left w:val="single" w:sz="4" w:space="0" w:color="404040" w:themeColor="text2"/>
+              <w:bottom w:val="single" w:sz="4" w:space="0" w:color="404040" w:themeColor="text2"/>
+              <w:right w:val="single" w:sz="4" w:space="0" w:color="404040" w:themeColor="text2"/>
+            </w:tcBorders>
             <w:vAlign w:val="center"/>
           </w:tcPr>
           <w:p>
             <w:pPr>
-              <w:spacing w:before="80" w:after="80"/>
-              <w:jc w:val="center"/>
-            </w:pPr>
-            <w:r>
-              <w:rPr>
-                <w:rFonts w:ascii="Calibri" w:hAnsi="Calibri"/>
-                <w:b/>
-                <w:color w:val="FFFFFF"/>
-                <w:sz w:val="20"/>
-              </w:rPr>
-              <w:t>2022</w:t>
-            </w:r>
-          </w:p>
-        </w:tc>
-        <w:tc>
-          <w:tcPr>
-            <w:tcW w:type="dxa" w:w="7776"/>
-            <w:shd w:val="clear" w:color="auto" w:fill="FDF2F8"/>
-            <w:vAlign w:val="center"/>
-          </w:tcPr>
-          <w:p>
-            <w:pPr>
-              <w:spacing w:before="80" w:after="80"/>
+              <w:spacing w:before="60" w:after="60"/>
               <w:ind w:left="72"/>
               <w:jc w:val="left"/>
             </w:pPr>
             <w:r>
               <w:rPr>
-                <w:rFonts w:ascii="Calibri" w:hAnsi="Calibri"/>
+                <w:rFonts w:ascii="Arial" w:hAnsi="Arial"/>
+                <w:b/>
+                <w:i w:val="0"/>
+                <w:color w:val="FF8200"/>
+                <w:sz w:val="18"/>
+              </w:rPr>
+              <w:t>2022</w:t>
+            </w:r>
+            <w:r>
+              <w:rPr>
+                <w:rFonts w:ascii="Arial" w:hAnsi="Arial"/>
                 <w:b w:val="0"/>
-                <w:color w:val="1A2A3A"/>
-                <w:sz w:val="22"/>
+                <w:i w:val="0"/>
+                <w:color w:val="404040"/>
+                <w:sz w:val="18"/>
               </w:rPr>
-              <w:t>Lee County Joint Local Mitigation Strategy</w:t>
+              <w:t xml:space="preserve"> Lee County Joint Local Mitigation Strategy</w:t>
             </w:r>
           </w:p>
         </w:tc>
@@ -486,21 +463,28 @@
       <w:tr>
         <w:tc>
           <w:tcPr>
-            <w:tcW w:type="dxa" w:w="792"/>
-            <w:shd w:val="clear" w:color="auto" w:fill="C0392B"/>
+            <w:tcW w:type="dxa" w:w="864"/>
+            <w:shd w:val="clear" w:color="auto" w:fill="D0CFCD"/>
+            <w:tcBorders>
+              <w:top w:val="single" w:sz="4" w:space="0" w:color="404040" w:themeColor="text2"/>
+              <w:left w:val="single" w:sz="4" w:space="0" w:color="404040" w:themeColor="text2"/>
+              <w:bottom w:val="single" w:sz="4" w:space="0" w:color="404040" w:themeColor="text2"/>
+              <w:right w:val="single" w:sz="4" w:space="0" w:color="404040" w:themeColor="text2"/>
+            </w:tcBorders>
             <w:vAlign w:val="center"/>
           </w:tcPr>
           <w:p>
             <w:pPr>
-              <w:spacing w:before="80" w:after="80"/>
+              <w:spacing w:before="60" w:after="60"/>
               <w:jc w:val="center"/>
             </w:pPr>
             <w:r>
               <w:rPr>
-                <w:rFonts w:ascii="Calibri" w:hAnsi="Calibri"/>
+                <w:rFonts w:ascii="Arial" w:hAnsi="Arial"/>
                 <w:b/>
-                <w:color w:val="FFFFFF"/>
-                <w:sz w:val="26"/>
+                <w:i w:val="0"/>
+                <w:color w:val="404040"/>
+                <w:sz w:val="18"/>
               </w:rPr>
               <w:t>6</w:t>
             </w:r>
@@ -508,46 +492,41 @@
         </w:tc>
         <w:tc>
           <w:tcPr>
-            <w:tcW w:type="dxa" w:w="1512"/>
-            <w:shd w:val="clear" w:color="auto" w:fill="C0392B"/>
+            <w:tcW w:type="dxa" w:w="8496"/>
+            <w:shd w:val="clear" w:color="auto" w:fill="D0CFCD"/>
+            <w:tcBorders>
+              <w:top w:val="single" w:sz="4" w:space="0" w:color="404040" w:themeColor="text2"/>
+              <w:left w:val="single" w:sz="4" w:space="0" w:color="404040" w:themeColor="text2"/>
+              <w:bottom w:val="single" w:sz="4" w:space="0" w:color="404040" w:themeColor="text2"/>
+              <w:right w:val="single" w:sz="4" w:space="0" w:color="404040" w:themeColor="text2"/>
+            </w:tcBorders>
             <w:vAlign w:val="center"/>
           </w:tcPr>
           <w:p>
             <w:pPr>
-              <w:spacing w:before="80" w:after="80"/>
-              <w:jc w:val="center"/>
-            </w:pPr>
-            <w:r>
-              <w:rPr>
-                <w:rFonts w:ascii="Calibri" w:hAnsi="Calibri"/>
-                <w:b/>
-                <w:color w:val="FFFFFF"/>
-                <w:sz w:val="20"/>
-              </w:rPr>
-              <w:t>2024</w:t>
-            </w:r>
-          </w:p>
-        </w:tc>
-        <w:tc>
-          <w:tcPr>
-            <w:tcW w:type="dxa" w:w="7776"/>
-            <w:shd w:val="clear" w:color="auto" w:fill="FEF9E7"/>
-            <w:vAlign w:val="center"/>
-          </w:tcPr>
-          <w:p>
-            <w:pPr>
-              <w:spacing w:before="80" w:after="80"/>
+              <w:spacing w:before="60" w:after="60"/>
               <w:ind w:left="72"/>
               <w:jc w:val="left"/>
             </w:pPr>
             <w:r>
               <w:rPr>
-                <w:rFonts w:ascii="Calibri" w:hAnsi="Calibri"/>
+                <w:rFonts w:ascii="Arial" w:hAnsi="Arial"/>
+                <w:b/>
+                <w:i w:val="0"/>
+                <w:color w:val="FF8200"/>
+                <w:sz w:val="18"/>
+              </w:rPr>
+              <w:t>2024</w:t>
+            </w:r>
+            <w:r>
+              <w:rPr>
+                <w:rFonts w:ascii="Arial" w:hAnsi="Arial"/>
                 <w:b w:val="0"/>
-                <w:color w:val="1A2A3A"/>
-                <w:sz w:val="22"/>
+                <w:i w:val="0"/>
+                <w:color w:val="404040"/>
+                <w:sz w:val="18"/>
               </w:rPr>
-              <w:t>Village of Estero Narrative Provided to FEMA</w:t>
+              <w:t xml:space="preserve"> Village of Estero Narrative Provided to FEMA</w:t>
             </w:r>
           </w:p>
         </w:tc>
@@ -555,21 +534,28 @@
       <w:tr>
         <w:tc>
           <w:tcPr>
-            <w:tcW w:type="dxa" w:w="792"/>
-            <w:shd w:val="clear" w:color="auto" w:fill="2A6496"/>
+            <w:tcW w:type="dxa" w:w="864"/>
+            <w:shd w:val="clear" w:color="auto" w:fill="FFFFFF"/>
+            <w:tcBorders>
+              <w:top w:val="single" w:sz="4" w:space="0" w:color="404040" w:themeColor="text2"/>
+              <w:left w:val="single" w:sz="4" w:space="0" w:color="404040" w:themeColor="text2"/>
+              <w:bottom w:val="single" w:sz="4" w:space="0" w:color="404040" w:themeColor="text2"/>
+              <w:right w:val="single" w:sz="4" w:space="0" w:color="404040" w:themeColor="text2"/>
+            </w:tcBorders>
             <w:vAlign w:val="center"/>
           </w:tcPr>
           <w:p>
             <w:pPr>
-              <w:spacing w:before="80" w:after="80"/>
+              <w:spacing w:before="60" w:after="60"/>
               <w:jc w:val="center"/>
             </w:pPr>
             <w:r>
               <w:rPr>
-                <w:rFonts w:ascii="Calibri" w:hAnsi="Calibri"/>
+                <w:rFonts w:ascii="Arial" w:hAnsi="Arial"/>
                 <w:b/>
-                <w:color w:val="FFFFFF"/>
-                <w:sz w:val="26"/>
+                <w:i w:val="0"/>
+                <w:color w:val="404040"/>
+                <w:sz w:val="18"/>
               </w:rPr>
               <w:t>7</w:t>
             </w:r>
@@ -577,46 +563,41 @@
         </w:tc>
         <w:tc>
           <w:tcPr>
-            <w:tcW w:type="dxa" w:w="1512"/>
-            <w:shd w:val="clear" w:color="auto" w:fill="2A6496"/>
+            <w:tcW w:type="dxa" w:w="8496"/>
+            <w:shd w:val="clear" w:color="auto" w:fill="FFFFFF"/>
+            <w:tcBorders>
+              <w:top w:val="single" w:sz="4" w:space="0" w:color="404040" w:themeColor="text2"/>
+              <w:left w:val="single" w:sz="4" w:space="0" w:color="404040" w:themeColor="text2"/>
+              <w:bottom w:val="single" w:sz="4" w:space="0" w:color="404040" w:themeColor="text2"/>
+              <w:right w:val="single" w:sz="4" w:space="0" w:color="404040" w:themeColor="text2"/>
+            </w:tcBorders>
             <w:vAlign w:val="center"/>
           </w:tcPr>
           <w:p>
             <w:pPr>
-              <w:spacing w:before="80" w:after="80"/>
-              <w:jc w:val="center"/>
-            </w:pPr>
-            <w:r>
-              <w:rPr>
-                <w:rFonts w:ascii="Calibri" w:hAnsi="Calibri"/>
-                <w:b/>
-                <w:color w:val="FFFFFF"/>
-                <w:sz w:val="20"/>
-              </w:rPr>
-              <w:t>2018</w:t>
-            </w:r>
-          </w:p>
-        </w:tc>
-        <w:tc>
-          <w:tcPr>
-            <w:tcW w:type="dxa" w:w="7776"/>
-            <w:shd w:val="clear" w:color="auto" w:fill="EAF3FB"/>
-            <w:vAlign w:val="center"/>
-          </w:tcPr>
-          <w:p>
-            <w:pPr>
-              <w:spacing w:before="80" w:after="80"/>
+              <w:spacing w:before="60" w:after="60"/>
               <w:ind w:left="72"/>
               <w:jc w:val="left"/>
             </w:pPr>
             <w:r>
               <w:rPr>
-                <w:rFonts w:ascii="Calibri" w:hAnsi="Calibri"/>
+                <w:rFonts w:ascii="Arial" w:hAnsi="Arial"/>
+                <w:b/>
+                <w:i w:val="0"/>
+                <w:color w:val="FF8200"/>
+                <w:sz w:val="18"/>
+              </w:rPr>
+              <w:t>2018</w:t>
+            </w:r>
+            <w:r>
+              <w:rPr>
+                <w:rFonts w:ascii="Arial" w:hAnsi="Arial"/>
                 <w:b w:val="0"/>
-                <w:color w:val="1A2A3A"/>
-                <w:sz w:val="22"/>
+                <w:i w:val="0"/>
+                <w:color w:val="404040"/>
+                <w:sz w:val="18"/>
               </w:rPr>
-              <w:t>Estero River, Imperial River, &amp; Springs Creek Storm Assessment Summary Report</w:t>
+              <w:t xml:space="preserve"> Estero River, Imperial River, &amp; Springs Creek Storm Assessment Summary Report</w:t>
             </w:r>
           </w:p>
         </w:tc>
@@ -624,21 +605,28 @@
       <w:tr>
         <w:tc>
           <w:tcPr>
-            <w:tcW w:type="dxa" w:w="792"/>
-            <w:shd w:val="clear" w:color="auto" w:fill="1A8A7A"/>
+            <w:tcW w:type="dxa" w:w="864"/>
+            <w:shd w:val="clear" w:color="auto" w:fill="D0CFCD"/>
+            <w:tcBorders>
+              <w:top w:val="single" w:sz="4" w:space="0" w:color="404040" w:themeColor="text2"/>
+              <w:left w:val="single" w:sz="4" w:space="0" w:color="404040" w:themeColor="text2"/>
+              <w:bottom w:val="single" w:sz="4" w:space="0" w:color="404040" w:themeColor="text2"/>
+              <w:right w:val="single" w:sz="4" w:space="0" w:color="404040" w:themeColor="text2"/>
+            </w:tcBorders>
             <w:vAlign w:val="center"/>
           </w:tcPr>
           <w:p>
             <w:pPr>
-              <w:spacing w:before="80" w:after="80"/>
+              <w:spacing w:before="60" w:after="60"/>
               <w:jc w:val="center"/>
             </w:pPr>
             <w:r>
               <w:rPr>
-                <w:rFonts w:ascii="Calibri" w:hAnsi="Calibri"/>
+                <w:rFonts w:ascii="Arial" w:hAnsi="Arial"/>
                 <w:b/>
-                <w:color w:val="FFFFFF"/>
-                <w:sz w:val="26"/>
+                <w:i w:val="0"/>
+                <w:color w:val="404040"/>
+                <w:sz w:val="18"/>
               </w:rPr>
               <w:t>8</w:t>
             </w:r>
@@ -646,46 +634,41 @@
         </w:tc>
         <w:tc>
           <w:tcPr>
-            <w:tcW w:type="dxa" w:w="1512"/>
-            <w:shd w:val="clear" w:color="auto" w:fill="1A8A7A"/>
+            <w:tcW w:type="dxa" w:w="8496"/>
+            <w:shd w:val="clear" w:color="auto" w:fill="D0CFCD"/>
+            <w:tcBorders>
+              <w:top w:val="single" w:sz="4" w:space="0" w:color="404040" w:themeColor="text2"/>
+              <w:left w:val="single" w:sz="4" w:space="0" w:color="404040" w:themeColor="text2"/>
+              <w:bottom w:val="single" w:sz="4" w:space="0" w:color="404040" w:themeColor="text2"/>
+              <w:right w:val="single" w:sz="4" w:space="0" w:color="404040" w:themeColor="text2"/>
+            </w:tcBorders>
             <w:vAlign w:val="center"/>
           </w:tcPr>
           <w:p>
             <w:pPr>
-              <w:spacing w:before="80" w:after="80"/>
-              <w:jc w:val="center"/>
-            </w:pPr>
-            <w:r>
-              <w:rPr>
-                <w:rFonts w:ascii="Calibri" w:hAnsi="Calibri"/>
-                <w:b/>
-                <w:color w:val="FFFFFF"/>
-                <w:sz w:val="20"/>
-              </w:rPr>
-              <w:t>2021</w:t>
-            </w:r>
-          </w:p>
-        </w:tc>
-        <w:tc>
-          <w:tcPr>
-            <w:tcW w:type="dxa" w:w="7776"/>
-            <w:shd w:val="clear" w:color="auto" w:fill="E6F4EA"/>
-            <w:vAlign w:val="center"/>
-          </w:tcPr>
-          <w:p>
-            <w:pPr>
-              <w:spacing w:before="80" w:after="80"/>
+              <w:spacing w:before="60" w:after="60"/>
               <w:ind w:left="72"/>
               <w:jc w:val="left"/>
             </w:pPr>
             <w:r>
               <w:rPr>
-                <w:rFonts w:ascii="Calibri" w:hAnsi="Calibri"/>
+                <w:rFonts w:ascii="Arial" w:hAnsi="Arial"/>
+                <w:b/>
+                <w:i w:val="0"/>
+                <w:color w:val="FF8200"/>
+                <w:sz w:val="18"/>
+              </w:rPr>
+              <w:t>2021</w:t>
+            </w:r>
+            <w:r>
+              <w:rPr>
+                <w:rFonts w:ascii="Arial" w:hAnsi="Arial"/>
                 <w:b w:val="0"/>
-                <w:color w:val="1A2A3A"/>
-                <w:sz w:val="22"/>
+                <w:i w:val="0"/>
+                <w:color w:val="404040"/>
+                <w:sz w:val="18"/>
               </w:rPr>
-              <w:t>South Lee County Watershed Initiative Hydrological Modeling Project Final Report</w:t>
+              <w:t xml:space="preserve"> South Lee County Watershed Initiative Hydrological Modeling Project Final Report</w:t>
             </w:r>
           </w:p>
         </w:tc>
@@ -693,21 +676,28 @@
       <w:tr>
         <w:tc>
           <w:tcPr>
-            <w:tcW w:type="dxa" w:w="792"/>
-            <w:shd w:val="clear" w:color="auto" w:fill="D4840D"/>
+            <w:tcW w:type="dxa" w:w="864"/>
+            <w:shd w:val="clear" w:color="auto" w:fill="FFFFFF"/>
+            <w:tcBorders>
+              <w:top w:val="single" w:sz="4" w:space="0" w:color="404040" w:themeColor="text2"/>
+              <w:left w:val="single" w:sz="4" w:space="0" w:color="404040" w:themeColor="text2"/>
+              <w:bottom w:val="single" w:sz="4" w:space="0" w:color="404040" w:themeColor="text2"/>
+              <w:right w:val="single" w:sz="4" w:space="0" w:color="404040" w:themeColor="text2"/>
+            </w:tcBorders>
             <w:vAlign w:val="center"/>
           </w:tcPr>
           <w:p>
             <w:pPr>
-              <w:spacing w:before="80" w:after="80"/>
+              <w:spacing w:before="60" w:after="60"/>
               <w:jc w:val="center"/>
             </w:pPr>
             <w:r>
               <w:rPr>
-                <w:rFonts w:ascii="Calibri" w:hAnsi="Calibri"/>
+                <w:rFonts w:ascii="Arial" w:hAnsi="Arial"/>
                 <w:b/>
-                <w:color w:val="FFFFFF"/>
-                <w:sz w:val="26"/>
+                <w:i w:val="0"/>
+                <w:color w:val="404040"/>
+                <w:sz w:val="18"/>
               </w:rPr>
               <w:t>9</w:t>
             </w:r>
@@ -715,46 +705,41 @@
         </w:tc>
         <w:tc>
           <w:tcPr>
-            <w:tcW w:type="dxa" w:w="1512"/>
-            <w:shd w:val="clear" w:color="auto" w:fill="D4840D"/>
+            <w:tcW w:type="dxa" w:w="8496"/>
+            <w:shd w:val="clear" w:color="auto" w:fill="FFFFFF"/>
+            <w:tcBorders>
+              <w:top w:val="single" w:sz="4" w:space="0" w:color="404040" w:themeColor="text2"/>
+              <w:left w:val="single" w:sz="4" w:space="0" w:color="404040" w:themeColor="text2"/>
+              <w:bottom w:val="single" w:sz="4" w:space="0" w:color="404040" w:themeColor="text2"/>
+              <w:right w:val="single" w:sz="4" w:space="0" w:color="404040" w:themeColor="text2"/>
+            </w:tcBorders>
             <w:vAlign w:val="center"/>
           </w:tcPr>
           <w:p>
             <w:pPr>
-              <w:spacing w:before="80" w:after="80"/>
-              <w:jc w:val="center"/>
-            </w:pPr>
-            <w:r>
-              <w:rPr>
-                <w:rFonts w:ascii="Calibri" w:hAnsi="Calibri"/>
-                <w:b/>
-                <w:color w:val="FFFFFF"/>
-                <w:sz w:val="20"/>
-              </w:rPr>
-              <w:t>2025</w:t>
-            </w:r>
-          </w:p>
-        </w:tc>
-        <w:tc>
-          <w:tcPr>
-            <w:tcW w:type="dxa" w:w="7776"/>
-            <w:shd w:val="clear" w:color="auto" w:fill="FEF9E7"/>
-            <w:vAlign w:val="center"/>
-          </w:tcPr>
-          <w:p>
-            <w:pPr>
-              <w:spacing w:before="80" w:after="80"/>
+              <w:spacing w:before="60" w:after="60"/>
               <w:ind w:left="72"/>
               <w:jc w:val="left"/>
             </w:pPr>
             <w:r>
               <w:rPr>
-                <w:rFonts w:ascii="Calibri" w:hAnsi="Calibri"/>
+                <w:rFonts w:ascii="Arial" w:hAnsi="Arial"/>
+                <w:b/>
+                <w:i w:val="0"/>
+                <w:color w:val="FF8200"/>
+                <w:sz w:val="18"/>
+              </w:rPr>
+              <w:t>2025</w:t>
+            </w:r>
+            <w:r>
+              <w:rPr>
+                <w:rFonts w:ascii="Arial" w:hAnsi="Arial"/>
                 <w:b w:val="0"/>
-                <w:color w:val="1A2A3A"/>
-                <w:sz w:val="22"/>
+                <w:i w:val="0"/>
+                <w:color w:val="404040"/>
+                <w:sz w:val="18"/>
               </w:rPr>
-              <w:t>Lee County Vulnerability Assessment Report</w:t>
+              <w:t xml:space="preserve"> Lee County Vulnerability Assessment Report</w:t>
             </w:r>
           </w:p>
         </w:tc>
@@ -762,21 +747,28 @@
       <w:tr>
         <w:tc>
           <w:tcPr>
-            <w:tcW w:type="dxa" w:w="792"/>
-            <w:shd w:val="clear" w:color="auto" w:fill="D4840D"/>
+            <w:tcW w:type="dxa" w:w="864"/>
+            <w:shd w:val="clear" w:color="auto" w:fill="D0CFCD"/>
+            <w:tcBorders>
+              <w:top w:val="single" w:sz="4" w:space="0" w:color="404040" w:themeColor="text2"/>
+              <w:left w:val="single" w:sz="4" w:space="0" w:color="404040" w:themeColor="text2"/>
+              <w:bottom w:val="single" w:sz="4" w:space="0" w:color="404040" w:themeColor="text2"/>
+              <w:right w:val="single" w:sz="4" w:space="0" w:color="404040" w:themeColor="text2"/>
+            </w:tcBorders>
             <w:vAlign w:val="center"/>
           </w:tcPr>
           <w:p>
             <w:pPr>
-              <w:spacing w:before="80" w:after="80"/>
+              <w:spacing w:before="60" w:after="60"/>
               <w:jc w:val="center"/>
             </w:pPr>
             <w:r>
               <w:rPr>
-                <w:rFonts w:ascii="Calibri" w:hAnsi="Calibri"/>
+                <w:rFonts w:ascii="Arial" w:hAnsi="Arial"/>
                 <w:b/>
-                <w:color w:val="FFFFFF"/>
-                <w:sz w:val="26"/>
+                <w:i w:val="0"/>
+                <w:color w:val="404040"/>
+                <w:sz w:val="18"/>
               </w:rPr>
               <w:t>10</w:t>
             </w:r>
@@ -784,46 +776,41 @@
         </w:tc>
         <w:tc>
           <w:tcPr>
-            <w:tcW w:type="dxa" w:w="1512"/>
-            <w:shd w:val="clear" w:color="auto" w:fill="D4840D"/>
+            <w:tcW w:type="dxa" w:w="8496"/>
+            <w:shd w:val="clear" w:color="auto" w:fill="D0CFCD"/>
+            <w:tcBorders>
+              <w:top w:val="single" w:sz="4" w:space="0" w:color="404040" w:themeColor="text2"/>
+              <w:left w:val="single" w:sz="4" w:space="0" w:color="404040" w:themeColor="text2"/>
+              <w:bottom w:val="single" w:sz="4" w:space="0" w:color="404040" w:themeColor="text2"/>
+              <w:right w:val="single" w:sz="4" w:space="0" w:color="404040" w:themeColor="text2"/>
+            </w:tcBorders>
             <w:vAlign w:val="center"/>
           </w:tcPr>
           <w:p>
             <w:pPr>
-              <w:spacing w:before="80" w:after="80"/>
-              <w:jc w:val="center"/>
-            </w:pPr>
-            <w:r>
-              <w:rPr>
-                <w:rFonts w:ascii="Calibri" w:hAnsi="Calibri"/>
-                <w:b/>
-                <w:color w:val="FFFFFF"/>
-                <w:sz w:val="20"/>
-              </w:rPr>
-              <w:t>2025</w:t>
-            </w:r>
-          </w:p>
-        </w:tc>
-        <w:tc>
-          <w:tcPr>
-            <w:tcW w:type="dxa" w:w="7776"/>
-            <w:shd w:val="clear" w:color="auto" w:fill="FDF2F8"/>
-            <w:vAlign w:val="center"/>
-          </w:tcPr>
-          <w:p>
-            <w:pPr>
-              <w:spacing w:before="80" w:after="80"/>
+              <w:spacing w:before="60" w:after="60"/>
               <w:ind w:left="72"/>
               <w:jc w:val="left"/>
             </w:pPr>
             <w:r>
               <w:rPr>
-                <w:rFonts w:ascii="Calibri" w:hAnsi="Calibri"/>
+                <w:rFonts w:ascii="Arial" w:hAnsi="Arial"/>
+                <w:b/>
+                <w:i w:val="0"/>
+                <w:color w:val="FF8200"/>
+                <w:sz w:val="18"/>
+              </w:rPr>
+              <w:t>2025</w:t>
+            </w:r>
+            <w:r>
+              <w:rPr>
+                <w:rFonts w:ascii="Arial" w:hAnsi="Arial"/>
                 <w:b w:val="0"/>
-                <w:color w:val="1A2A3A"/>
-                <w:sz w:val="22"/>
+                <w:i w:val="0"/>
+                <w:color w:val="404040"/>
+                <w:sz w:val="18"/>
               </w:rPr>
-              <w:t>Lee County Coastal Flood Adaptation Plan</w:t>
+              <w:t xml:space="preserve"> Lee County Coastal Flood Adaptation Plan</w:t>
             </w:r>
           </w:p>
         </w:tc>
@@ -831,21 +818,28 @@
       <w:tr>
         <w:tc>
           <w:tcPr>
-            <w:tcW w:type="dxa" w:w="792"/>
-            <w:shd w:val="clear" w:color="auto" w:fill="D4840D"/>
+            <w:tcW w:type="dxa" w:w="864"/>
+            <w:shd w:val="clear" w:color="auto" w:fill="FFFFFF"/>
+            <w:tcBorders>
+              <w:top w:val="single" w:sz="4" w:space="0" w:color="404040" w:themeColor="text2"/>
+              <w:left w:val="single" w:sz="4" w:space="0" w:color="404040" w:themeColor="text2"/>
+              <w:bottom w:val="single" w:sz="4" w:space="0" w:color="404040" w:themeColor="text2"/>
+              <w:right w:val="single" w:sz="4" w:space="0" w:color="404040" w:themeColor="text2"/>
+            </w:tcBorders>
             <w:vAlign w:val="center"/>
           </w:tcPr>
           <w:p>
             <w:pPr>
-              <w:spacing w:before="80" w:after="80"/>
+              <w:spacing w:before="60" w:after="60"/>
               <w:jc w:val="center"/>
             </w:pPr>
             <w:r>
               <w:rPr>
-                <w:rFonts w:ascii="Calibri" w:hAnsi="Calibri"/>
+                <w:rFonts w:ascii="Arial" w:hAnsi="Arial"/>
                 <w:b/>
-                <w:color w:val="FFFFFF"/>
-                <w:sz w:val="26"/>
+                <w:i w:val="0"/>
+                <w:color w:val="404040"/>
+                <w:sz w:val="18"/>
               </w:rPr>
               <w:t>11</w:t>
             </w:r>
@@ -853,46 +847,41 @@
         </w:tc>
         <w:tc>
           <w:tcPr>
-            <w:tcW w:type="dxa" w:w="1512"/>
-            <w:shd w:val="clear" w:color="auto" w:fill="D4840D"/>
+            <w:tcW w:type="dxa" w:w="8496"/>
+            <w:shd w:val="clear" w:color="auto" w:fill="FFFFFF"/>
+            <w:tcBorders>
+              <w:top w:val="single" w:sz="4" w:space="0" w:color="404040" w:themeColor="text2"/>
+              <w:left w:val="single" w:sz="4" w:space="0" w:color="404040" w:themeColor="text2"/>
+              <w:bottom w:val="single" w:sz="4" w:space="0" w:color="404040" w:themeColor="text2"/>
+              <w:right w:val="single" w:sz="4" w:space="0" w:color="404040" w:themeColor="text2"/>
+            </w:tcBorders>
             <w:vAlign w:val="center"/>
           </w:tcPr>
           <w:p>
             <w:pPr>
-              <w:spacing w:before="80" w:after="80"/>
-              <w:jc w:val="center"/>
-            </w:pPr>
-            <w:r>
-              <w:rPr>
-                <w:rFonts w:ascii="Calibri" w:hAnsi="Calibri"/>
-                <w:b/>
-                <w:color w:val="FFFFFF"/>
-                <w:sz w:val="20"/>
-              </w:rPr>
-              <w:t>2025</w:t>
-            </w:r>
-          </w:p>
-        </w:tc>
-        <w:tc>
-          <w:tcPr>
-            <w:tcW w:type="dxa" w:w="7776"/>
-            <w:shd w:val="clear" w:color="auto" w:fill="E6F4EA"/>
-            <w:vAlign w:val="center"/>
-          </w:tcPr>
-          <w:p>
-            <w:pPr>
-              <w:spacing w:before="80" w:after="80"/>
+              <w:spacing w:before="60" w:after="60"/>
               <w:ind w:left="72"/>
               <w:jc w:val="left"/>
             </w:pPr>
             <w:r>
               <w:rPr>
-                <w:rFonts w:ascii="Calibri" w:hAnsi="Calibri"/>
+                <w:rFonts w:ascii="Arial" w:hAnsi="Arial"/>
+                <w:b/>
+                <w:i w:val="0"/>
+                <w:color w:val="FF8200"/>
+                <w:sz w:val="18"/>
+              </w:rPr>
+              <w:t>2025</w:t>
+            </w:r>
+            <w:r>
+              <w:rPr>
+                <w:rFonts w:ascii="Arial" w:hAnsi="Arial"/>
                 <w:b w:val="0"/>
-                <w:color w:val="1A2A3A"/>
-                <w:sz w:val="22"/>
+                <w:i w:val="0"/>
+                <w:color w:val="404040"/>
+                <w:sz w:val="18"/>
               </w:rPr>
-              <w:t>Village of Estero Progress Report on Local Mitigation Strategy</w:t>
+              <w:t xml:space="preserve"> Village of Estero Progress Report on Local Mitigation Strategy</w:t>
             </w:r>
           </w:p>
         </w:tc>

</xml_diff>